<commit_message>
Correct two equation numbers and the appendix numbering in the letter
The RS accumulation is Equation 9, not 8 - the letter inherited the wrong
number from Table 1's hand-typed cell, now fixed in the manuscript. And the
appendix opens with Proposition A.1, not Remark A.1.

Co-Authored-By: Claude Opus 5 <noreply@anthropic.com>
Claude-Session: https://claude.ai/code/session_01Le4sDd4SvX8EGzq2iKyRoL
</commit_message>
<xml_diff>
--- a/manuscript/response_letter_2026-09-08.docx
+++ b/manuscript/response_letter_2026-09-08.docx
@@ -796,7 +796,7 @@
           <w:b/>
           <w:color w:val="1F4E9E"/>
         </w:rPr>
-        <w:t xml:space="preserve">Remarque A.1</w:t>
+        <w:t xml:space="preserve">Proposition A.1</w:t>
       </w:r>
       <w:r>
         <w:rPr>
@@ -1564,7 +1564,7 @@
         <w:pStyle w:val="BodyText"/>
       </w:pPr>
       <w:r>
-        <w:t xml:space="preserve">The first is derivation. Every prediction the paper tests is derived from the model equations at the point where it is used, in the Results, with the heavier proofs collected in a single Appendix. That is what replaces the verbal and cartoon arguments the comment objects to: the claims are no longer stated in words and then adjudicated by an ANOVA, they follow from the architecture, and the ANOVAs test them. Three examples. Because the drift of the second accumulation is the same in every condition (Equation 8), coherence and duration can act on response time only through the level maintained at the end of the first stage. Because that level is capped at the internal threshold (Equation 4), the coherence effect on response time is larger after a short stimulus than after a long one. And because temporal preparation is anchored to stimulus offset while the response signal follows it at a fixed interval, stimulus duration cancels from the ramp: it contributes the same amount in all six coherence × duration cells, so no behavioral effect whatever can separate the two models.</w:t>
+        <w:t xml:space="preserve">The first is derivation. Every prediction the paper tests is derived from the model equations at the point where it is used, in the Results, with the heavier proofs collected in a single Appendix. That is what replaces the verbal and cartoon arguments the comment objects to: the claims are no longer stated in words and then adjudicated by an ANOVA, they follow from the architecture, and the ANOVAs test them. Three examples. Because the drift of the second accumulation is the same in every condition (Equation 9), coherence and duration can act on response time only through the level maintained at the end of the first stage. Because that level is capped at the internal threshold (Equation 4), the coherence effect on response time is larger after a short stimulus than after a long one. And because temporal preparation is anchored to stimulus offset while the response signal follows it at a fixed interval, stimulus duration cancels from the ramp: it contributes the same amount in all six coherence × duration cells, so no behavioral effect whatever can separate the two models.</w:t>
       </w:r>
     </w:p>
     <w:p>
@@ -1628,7 +1628,7 @@
         <w:t xml:space="preserve"> </w:t>
       </w:r>
       <w:r>
-        <w:t xml:space="preserve">subsection of each window (the derivations, stated where they are used); Appendix, Remark A.1 to Remark A.6 (the proofs); Materials and Methods,</w:t>
+        <w:t xml:space="preserve">subsection of each window (the derivations, stated where they are used); Appendix, Proposition A.1 to Remark A.6 (the proofs); Materials and Methods,</w:t>
       </w:r>
       <w:r>
         <w:t xml:space="preserve"> </w:t>
@@ -1992,7 +1992,7 @@
         <w:pStyle w:val="BodyText"/>
       </w:pPr>
       <w:r>
-        <w:t xml:space="preserve">Structurally, adding a leak to the decision variable changes none of the derivations, since none of them uses leak-freeness. Three are worth spelling out. Discriminability at the end of a stimulus of length t is, under a leaky accumulator with leak γ, equal to (kc/σ)√(2/γ)·√(u/(2−u)) with u = 1 − e^(−γt); this increases in coherence, increases in duration through u, is exactly one half at c = 0 by symmetry, and reduces to kc√t/σ as γ → 0. So the accuracy predictions are leak-proof at any leak rate. The response-time predictions require only that the drift of the second accumulation be the same in every condition (Equation 8), so that coherence and duration act on response time through the maintained level alone, and that the maintained level be capped at the internal threshold (Equation 4); a leak alters the mapping from coherence to the maintained level but leaves both properties intact.</w:t>
+        <w:t xml:space="preserve">Structurally, adding a leak to the decision variable changes none of the derivations, since none of them uses leak-freeness. Three are worth spelling out. Discriminability at the end of a stimulus of length t is, under a leaky accumulator with leak γ, equal to (kc/σ)√(2/γ)·√(u/(2−u)) with u = 1 − e^(−γt); this increases in coherence, increases in duration through u, is exactly one half at c = 0 by symmetry, and reduces to kc√t/σ as γ → 0. So the accuracy predictions are leak-proof at any leak rate. The response-time predictions require only that the drift of the second accumulation be the same in every condition (Equation 9), so that coherence and duration act on response time through the maintained level alone, and that the maintained level be capped at the internal threshold (Equation 4); a leak alters the mapping from coherence to the maintained level but leaves both properties intact.</w:t>
       </w:r>
     </w:p>
     <w:p>
@@ -2128,7 +2128,7 @@
         <w:t xml:space="preserve"> </w:t>
       </w:r>
       <w:r>
-        <w:t xml:space="preserve">The reviewer is right that the response signal itself carries no directional evidence to resolve, but we intend the second phase as accumulation of the perceptual evidence that the signal is present and has been detected — a well-established construct in the one-choice/detection literature (e.g., Ratcliff &amp; Van Dongen, 2011; Smith, 1995), supported also by electroencephalographic signatures of accumulation under near-ceiling target detection (O’Connell et al., 2012), and distinct from the motion-discrimination accumulation of the first phase. The model uses exactly two properties of this stage: the drive is condition-independent (Equation 8), which places all condition effects on PMET into the starting point, and its increments are independent, which is what makes MET invariant across conditions. Nothing in the model depends on the signal carrying directional evidence, so the reviewer’s objection bears on the name we gave this stage, not on the mechanism itself, which would be unchanged under any label.</w:t>
+        <w:t xml:space="preserve">The reviewer is right that the response signal itself carries no directional evidence to resolve, but we intend the second phase as accumulation of the perceptual evidence that the signal is present and has been detected — a well-established construct in the one-choice/detection literature (e.g., Ratcliff &amp; Van Dongen, 2011; Smith, 1995), supported also by electroencephalographic signatures of accumulation under near-ceiling target detection (O’Connell et al., 2012), and distinct from the motion-discrimination accumulation of the first phase. The model uses exactly two properties of this stage: the drive is condition-independent (Equation 9), which places all condition effects on PMET into the starting point, and its increments are independent, which is what makes MET invariant across conditions. Nothing in the model depends on the signal carrying directional evidence, so the reviewer’s objection bears on the name we gave this stage, not on the mechanism itself, which would be unchanged under any label.</w:t>
       </w:r>
     </w:p>
     <w:p>

</xml_diff>